<commit_message>
updated CV and fixed linkedin link
</commit_message>
<xml_diff>
--- a/documents/Mike Speight CV 2017-v1.1.docx
+++ b/documents/Mike Speight CV 2017-v1.1.docx
@@ -912,7 +912,15 @@
         <w:pStyle w:val="CVNormal"/>
       </w:pPr>
       <w:r>
-        <w:t>May 2016 – March 2017</w:t>
+        <w:t xml:space="preserve">May </w:t>
+      </w:r>
+      <w:r>
+        <w:t>2016 – May</w:t>
+      </w:r>
+      <w:bookmarkStart w:id="0" w:name="_GoBack"/>
+      <w:bookmarkEnd w:id="0"/>
+      <w:r>
+        <w:t xml:space="preserve"> 2017</w:t>
       </w:r>
       <w:r>
         <w:t>:</w:t>
@@ -1124,8 +1132,6 @@
       <w:r>
         <w:t xml:space="preserve"> Moderniz</w:t>
       </w:r>
-      <w:bookmarkStart w:id="0" w:name="_GoBack"/>
-      <w:bookmarkEnd w:id="0"/>
       <w:r>
         <w:t>r, Require JS,</w:t>
       </w:r>

</xml_diff>